<commit_message>
Blackjack: cards multiply the initial scan; two-row history with multipliers
Cards are now x2..x40 of the INITIAL exposure (each card is a fresh scan),
replacing the dead fractional cards; x15 and x40 add invisible overexposure.
History shows two rows with the chosen multiplier under each image. Adds a
diagram on the Rules screen and slide 11; engine tests, guide, script and
checklist updated.

Co-Authored-By: Claude Sonnet 5.5 <noreply@anthropic.com>
</commit_message>
<xml_diff>
--- a/Knowledge_Guide.docx
+++ b/Knowledge_Guide.docx
@@ -2813,7 +2813,7 @@
         <w:rPr>
           <w:sz w:val="22"/>
         </w:rPr>
-        <w:t xml:space="preserve"> per exposure = 10·r, </w:t>
+        <w:t xml:space="preserve"> per scan = 10·r, </w:t>
       </w:r>
       <w:r>
         <w:rPr>
@@ -2838,13 +2838,13 @@
           <w:b/>
           <w:sz w:val="22"/>
         </w:rPr>
-        <w:t>Why no exact 1× route exists</w:t>
-      </w:r>
-      <w:r>
-        <w:rPr>
-          <w:sz w:val="22"/>
-        </w:rPr>
-        <w:t>: the start is 1/8.33 ≈ 0.12× and the cards are ×⅙, ¼, ⅓, ½, 2, 3, 4, 6. The best route is ×3 → ×3 = 1.08× (score 178.4).</w:t>
+        <w:t>Cards multiply the INITIAL scan, not the previous one.</w:t>
+      </w:r>
+      <w:r>
+        <w:rPr>
+          <w:sz w:val="22"/>
+        </w:rPr>
+        <w:t xml:space="preserve"> Each card is a fresh scan at r = r₀ × card (r₀ = 1/8.33 ≈ 0.12), so playing ×6 and then ×10 gives 10 × r₀ = 1.2, not 60 × r₀. Fractions (×½ and below) were removed: they could only make the image worse.</w:t>
       </w:r>
     </w:p>
     <w:p>
@@ -2856,13 +2856,62 @@
           <w:b/>
           <w:sz w:val="22"/>
         </w:rPr>
-        <w:t>Verified top 3 routes</w:t>
-      </w:r>
-      <w:r>
-        <w:rPr>
-          <w:sz w:val="22"/>
-        </w:rPr>
-        <w:t xml:space="preserve"> (exhaustive simulation of all sequences ≤ 4 cards, script in </w:t>
+        <w:t>Cards:</w:t>
+      </w:r>
+      <w:r>
+        <w:rPr>
+          <w:sz w:val="22"/>
+        </w:rPr>
+        <w:t xml:space="preserve"> ×2, ×3, ×4, ×6, ×8, ×10, ×15, ×40 → r = 0.24, 0.36, 0.48, 0.72, 0.96, 1.20, 1.80, 4.80. ×2–×6 are visibly grainy; ×8 (r = 0.96, Q 98) and ×10 (r = 1.2, Q 100) land near the ideal; ×15 is </w:t>
+      </w:r>
+      <w:r>
+        <w:rPr>
+          <w:b/>
+          <w:sz w:val="22"/>
+        </w:rPr>
+        <w:t>overexposure that looks identical</w:t>
+      </w:r>
+      <w:r>
+        <w:rPr>
+          <w:sz w:val="22"/>
+        </w:rPr>
+        <w:t xml:space="preserve"> but costs more dose; ×40 also looks fine yet pushes dose past the limit (the team is stopped).</w:t>
+      </w:r>
+    </w:p>
+    <w:p>
+      <w:pPr>
+        <w:pStyle w:val="ListBullet"/>
+      </w:pPr>
+      <w:r>
+        <w:rPr>
+          <w:b/>
+          <w:sz w:val="22"/>
+        </w:rPr>
+        <w:t>Why no exact route exists</w:t>
+      </w:r>
+      <w:r>
+        <w:rPr>
+          <w:sz w:val="22"/>
+        </w:rPr>
+        <w:t>: the ideal needs ×8.33. ×8 is just under (small grain, Q 98), ×10 just over (clean, slightly more dose). Real trade-off.</w:t>
+      </w:r>
+    </w:p>
+    <w:p>
+      <w:pPr>
+        <w:pStyle w:val="ListBullet"/>
+      </w:pPr>
+      <w:r>
+        <w:rPr>
+          <w:b/>
+          <w:sz w:val="22"/>
+        </w:rPr>
+        <w:t>Verified single-scan scores</w:t>
+      </w:r>
+      <w:r>
+        <w:rPr>
+          <w:sz w:val="22"/>
+        </w:rPr>
+        <w:t xml:space="preserve"> (exhaustive simulation of all sequences ≤ 4 cards, </w:t>
       </w:r>
       <w:r>
         <w:rPr>
@@ -2875,20 +2924,20 @@
         <w:rPr>
           <w:sz w:val="22"/>
         </w:rPr>
-        <w:t xml:space="preserve">): </w:t>
+        <w:t xml:space="preserve">): ×10 = </w:t>
       </w:r>
       <w:r>
         <w:rPr>
           <w:b/>
           <w:sz w:val="22"/>
         </w:rPr>
-        <w:t>×3 → ×3 = 178.4</w:t>
-      </w:r>
-      <w:r>
-        <w:rPr>
-          <w:sz w:val="22"/>
-        </w:rPr>
-        <w:t>, ×¼ → ×6 → ×6 = 176.9, ×2 → ×4 = 176.8.</w:t>
+        <w:t>183.8</w:t>
+      </w:r>
+      <w:r>
+        <w:rPr>
+          <w:sz w:val="22"/>
+        </w:rPr>
+        <w:t>, ×8 = 182.2, ×15 = 177.8, ×6 = 158.3, ×40 = 137.2. Best multi-scan: ×2 → ×10 = 178.4 (the exploratory scan costs ≈ 5 points). Lesson: the cheapest route is to read the grain, then pick the smallest card that looks clean, in one scan.</w:t>
       </w:r>
     </w:p>
     <w:p>

</xml_diff>

<commit_message>
Blackjack: cards chain on the last scan again; add START reference column
Reverts the "initial x card" rule: each card multiplies the team's last
scan (less predictable, fractional cards useful again). Once any team has
played, the original grainy image appears as a 4th column between Team Left
and Ideal. History keeps two rows with multipliers. Rules screen, slide 11,
script, guide and checklist updated.

Co-Authored-By: Claude Sonnet 5.5 <noreply@anthropic.com>
</commit_message>
<xml_diff>
--- a/Knowledge_Guide.docx
+++ b/Knowledge_Guide.docx
@@ -2807,26 +2807,52 @@
           <w:b/>
           <w:sz w:val="22"/>
         </w:rPr>
-        <w:t>Dose</w:t>
-      </w:r>
-      <w:r>
-        <w:rPr>
-          <w:sz w:val="22"/>
-        </w:rPr>
-        <w:t xml:space="preserve"> per scan = 10·r, </w:t>
+        <w:t>Cards chain:</w:t>
+      </w:r>
+      <w:r>
+        <w:rPr>
+          <w:sz w:val="22"/>
+        </w:rPr>
+        <w:t xml:space="preserve"> each card multiplies the team's </w:t>
+      </w:r>
+      <w:r>
+        <w:rPr>
+          <w:i/>
+          <w:sz w:val="22"/>
+        </w:rPr>
+        <w:t>last</w:t>
+      </w:r>
+      <w:r>
+        <w:rPr>
+          <w:sz w:val="22"/>
+        </w:rPr>
+        <w:t xml:space="preserve"> scan, so ×6 then ×3 = ×18 of the start. This makes the game less predictable than a lookup of "initial × card" and keeps the fractional cards useful for correcting an overshoot. The </w:t>
       </w:r>
       <w:r>
         <w:rPr>
           <w:b/>
           <w:sz w:val="22"/>
         </w:rPr>
-        <w:t>+3</w:t>
-      </w:r>
-      <w:r>
-        <w:rPr>
-          <w:sz w:val="22"/>
-        </w:rPr>
-        <w:t xml:space="preserve"> fixed cost per retake (repositioning, time, extra exposure). The +3 stops "deliberately under-expose first" from being a free strategy.</w:t>
+        <w:t>START image</w:t>
+      </w:r>
+      <w:r>
+        <w:rPr>
+          <w:sz w:val="22"/>
+        </w:rPr>
+        <w:t xml:space="preserve"> appears as a reference column once any team has played, and each team's </w:t>
+      </w:r>
+      <w:r>
+        <w:rPr>
+          <w:b/>
+          <w:sz w:val="22"/>
+        </w:rPr>
+        <w:t>history</w:t>
+      </w:r>
+      <w:r>
+        <w:rPr>
+          <w:sz w:val="22"/>
+        </w:rPr>
+        <w:t xml:space="preserve"> shows the multiplier used under every image.</w:t>
       </w:r>
     </w:p>
     <w:p>
@@ -2838,13 +2864,26 @@
           <w:b/>
           <w:sz w:val="22"/>
         </w:rPr>
-        <w:t>Cards multiply the INITIAL scan, not the previous one.</w:t>
-      </w:r>
-      <w:r>
-        <w:rPr>
-          <w:sz w:val="22"/>
-        </w:rPr>
-        <w:t xml:space="preserve"> Each card is a fresh scan at r = r₀ × card (r₀ = 1/8.33 ≈ 0.12), so playing ×6 and then ×10 gives 10 × r₀ = 1.2, not 60 × r₀. Fractions (×½ and below) were removed: they could only make the image worse.</w:t>
+        <w:t>Dose</w:t>
+      </w:r>
+      <w:r>
+        <w:rPr>
+          <w:sz w:val="22"/>
+        </w:rPr>
+        <w:t xml:space="preserve"> per exposure = 10·r, </w:t>
+      </w:r>
+      <w:r>
+        <w:rPr>
+          <w:b/>
+          <w:sz w:val="22"/>
+        </w:rPr>
+        <w:t>+3</w:t>
+      </w:r>
+      <w:r>
+        <w:rPr>
+          <w:sz w:val="22"/>
+        </w:rPr>
+        <w:t xml:space="preserve"> fixed cost per retake (repositioning, time, extra exposure). The +3 stops "deliberately under-expose first" from being a free strategy.</w:t>
       </w:r>
     </w:p>
     <w:p>
@@ -2856,26 +2895,13 @@
           <w:b/>
           <w:sz w:val="22"/>
         </w:rPr>
-        <w:t>Cards:</w:t>
-      </w:r>
-      <w:r>
-        <w:rPr>
-          <w:sz w:val="22"/>
-        </w:rPr>
-        <w:t xml:space="preserve"> ×2, ×3, ×4, ×6, ×8, ×10, ×15, ×40 → r = 0.24, 0.36, 0.48, 0.72, 0.96, 1.20, 1.80, 4.80. ×2–×6 are visibly grainy; ×8 (r = 0.96, Q 98) and ×10 (r = 1.2, Q 100) land near the ideal; ×15 is </w:t>
-      </w:r>
-      <w:r>
-        <w:rPr>
-          <w:b/>
-          <w:sz w:val="22"/>
-        </w:rPr>
-        <w:t>overexposure that looks identical</w:t>
-      </w:r>
-      <w:r>
-        <w:rPr>
-          <w:sz w:val="22"/>
-        </w:rPr>
-        <w:t xml:space="preserve"> but costs more dose; ×40 also looks fine yet pushes dose past the limit (the team is stopped).</w:t>
+        <w:t>Why no exact 1× route exists</w:t>
+      </w:r>
+      <w:r>
+        <w:rPr>
+          <w:sz w:val="22"/>
+        </w:rPr>
+        <w:t>: the start is 1/8.33 ≈ 0.12× and the cards are ×⅙, ¼, ⅓, ½, 2, 3, 4, 6. The best route is ×3 → ×3 = 1.08× (score 178.4).</w:t>
       </w:r>
     </w:p>
     <w:p>
@@ -2887,57 +2913,39 @@
           <w:b/>
           <w:sz w:val="22"/>
         </w:rPr>
-        <w:t>Why no exact route exists</w:t>
-      </w:r>
-      <w:r>
-        <w:rPr>
-          <w:sz w:val="22"/>
-        </w:rPr>
-        <w:t>: the ideal needs ×8.33. ×8 is just under (small grain, Q 98), ×10 just over (clean, slightly more dose). Real trade-off.</w:t>
-      </w:r>
-    </w:p>
-    <w:p>
-      <w:pPr>
-        <w:pStyle w:val="ListBullet"/>
-      </w:pPr>
+        <w:t>Verified top 3 routes</w:t>
+      </w:r>
+      <w:r>
+        <w:rPr>
+          <w:sz w:val="22"/>
+        </w:rPr>
+        <w:t xml:space="preserve"> (exhaustive simulation of all sequences ≤ 4 cards, script in </w:t>
+      </w:r>
+      <w:r>
+        <w:rPr>
+          <w:rFonts w:ascii="Courier New" w:hAnsi="Courier New"/>
+          <w:sz w:val="22"/>
+        </w:rPr>
+        <w:t>_build/test_engine.js</w:t>
+      </w:r>
+      <w:r>
+        <w:rPr>
+          <w:sz w:val="22"/>
+        </w:rPr>
+        <w:t xml:space="preserve">): </w:t>
+      </w:r>
       <w:r>
         <w:rPr>
           <w:b/>
           <w:sz w:val="22"/>
         </w:rPr>
-        <w:t>Verified single-scan scores</w:t>
-      </w:r>
-      <w:r>
-        <w:rPr>
-          <w:sz w:val="22"/>
-        </w:rPr>
-        <w:t xml:space="preserve"> (exhaustive simulation of all sequences ≤ 4 cards, </w:t>
-      </w:r>
-      <w:r>
-        <w:rPr>
-          <w:rFonts w:ascii="Courier New" w:hAnsi="Courier New"/>
-          <w:sz w:val="22"/>
-        </w:rPr>
-        <w:t>_build/test_engine.js</w:t>
-      </w:r>
-      <w:r>
-        <w:rPr>
-          <w:sz w:val="22"/>
-        </w:rPr>
-        <w:t xml:space="preserve">): ×10 = </w:t>
-      </w:r>
-      <w:r>
-        <w:rPr>
-          <w:b/>
-          <w:sz w:val="22"/>
-        </w:rPr>
-        <w:t>183.8</w:t>
-      </w:r>
-      <w:r>
-        <w:rPr>
-          <w:sz w:val="22"/>
-        </w:rPr>
-        <w:t>, ×8 = 182.2, ×15 = 177.8, ×6 = 158.3, ×40 = 137.2. Best multi-scan: ×2 → ×10 = 178.4 (the exploratory scan costs ≈ 5 points). Lesson: the cheapest route is to read the grain, then pick the smallest card that looks clean, in one scan.</w:t>
+        <w:t>×3 → ×3 = 178.4</w:t>
+      </w:r>
+      <w:r>
+        <w:rPr>
+          <w:sz w:val="22"/>
+        </w:rPr>
+        <w:t>, ×¼ → ×6 → ×6 = 176.9, ×2 → ×4 = 176.8.</w:t>
       </w:r>
     </w:p>
     <w:p>

</xml_diff>

<commit_message>
Blackjack: add x1.5 card (nine cards, keys 1-9)
Best route becomes x1.5 then x6 = 180.2 (x3 then x3 = 178.4); order
matters (x6 then x1.5 = 174.8). Engine tests, rules screen, slide 11,
script, guide and checklist updated.

Co-Authored-By: Claude Sonnet 5.5 <noreply@anthropic.com>
</commit_message>
<xml_diff>
--- a/Knowledge_Guide.docx
+++ b/Knowledge_Guide.docx
@@ -2826,7 +2826,7 @@
         <w:rPr>
           <w:sz w:val="22"/>
         </w:rPr>
-        <w:t xml:space="preserve"> scan, so ×6 then ×3 = ×18 of the start. This makes the game less predictable than a lookup of "initial × card" and keeps the fractional cards useful for correcting an overshoot. The </w:t>
+        <w:t xml:space="preserve"> scan, so ×6 then ×1.5 = ×9 of the start. This makes the game less predictable than a lookup of "initial × card" and keeps the fractional cards useful for correcting an overshoot. The </w:t>
       </w:r>
       <w:r>
         <w:rPr>
@@ -2901,7 +2901,20 @@
         <w:rPr>
           <w:sz w:val="22"/>
         </w:rPr>
-        <w:t>: the start is 1/8.33 ≈ 0.12× and the cards are ×⅙, ¼, ⅓, ½, 2, 3, 4, 6. The best route is ×3 → ×3 = 1.08× (score 178.4).</w:t>
+        <w:t xml:space="preserve">: the start is 1/8.33 ≈ 0.12× and the cards are ×⅙, ¼, ⅓, ½, 1.5, 2, 3, 4, 6. The best route is ×1.5 → ×6 = 1.08× (score 180.2); ×3 → ×3 reaches the same image for 178.4. </w:t>
+      </w:r>
+      <w:r>
+        <w:rPr>
+          <w:b/>
+          <w:sz w:val="22"/>
+        </w:rPr>
+        <w:t>Order matters:</w:t>
+      </w:r>
+      <w:r>
+        <w:rPr>
+          <w:sz w:val="22"/>
+        </w:rPr>
+        <w:t xml:space="preserve"> ×6 → ×1.5 reaches the same ×9 but scores only 174.8, because the intermediate scan costs more dose.</w:t>
       </w:r>
     </w:p>
     <w:p>
@@ -2939,13 +2952,13 @@
           <w:b/>
           <w:sz w:val="22"/>
         </w:rPr>
-        <w:t>×3 → ×3 = 178.4</w:t>
-      </w:r>
-      <w:r>
-        <w:rPr>
-          <w:sz w:val="22"/>
-        </w:rPr>
-        <w:t>, ×¼ → ×6 → ×6 = 176.9, ×2 → ×4 = 176.8.</w:t>
+        <w:t>×1.5 → ×6 = 180.2</w:t>
+      </w:r>
+      <w:r>
+        <w:rPr>
+          <w:sz w:val="22"/>
+        </w:rPr>
+        <w:t>, ×3 → ×3 = 178.4, ×¼ → ×6 → ×6 = 176.9 (then ×2 → ×4 = 176.8).</w:t>
       </w:r>
     </w:p>
     <w:p>

</xml_diff>

<commit_message>
Blackjack: random start exposure and noise pattern each game
Start is drawn from 0.08-0.16x of ideal (same for both teams) so a memorised
route from an example run cannot be reused. ?r0=0.12 fixes it for rehearsal.
Guide and checklist updated.

Co-Authored-By: Claude Sonnet 5.5 <noreply@anthropic.com>
</commit_message>
<xml_diff>
--- a/Knowledge_Guide.docx
+++ b/Knowledge_Guide.docx
@@ -2884,6 +2884,37 @@
           <w:sz w:val="22"/>
         </w:rPr>
         <w:t xml:space="preserve"> fixed cost per retake (repositioning, time, extra exposure). The +3 stops "deliberately under-expose first" from being a free strategy.</w:t>
+      </w:r>
+    </w:p>
+    <w:p>
+      <w:pPr>
+        <w:pStyle w:val="ListBullet"/>
+      </w:pPr>
+      <w:r>
+        <w:rPr>
+          <w:b/>
+          <w:sz w:val="22"/>
+        </w:rPr>
+        <w:t>Random start (current behaviour):</w:t>
+      </w:r>
+      <w:r>
+        <w:rPr>
+          <w:sz w:val="22"/>
+        </w:rPr>
+        <w:t xml:space="preserve"> every game draws a new start exposure r₀ uniformly from 0.08–0.16× of the ideal (about ×6.25–×12.5 away) and a new noise pattern, the same for both teams, so an example run cannot be memorised. Open the lab with </w:t>
+      </w:r>
+      <w:r>
+        <w:rPr>
+          <w:rFonts w:ascii="Courier New" w:hAnsi="Courier New"/>
+          <w:sz w:val="22"/>
+        </w:rPr>
+        <w:t>?r0=0.12</w:t>
+      </w:r>
+      <w:r>
+        <w:rPr>
+          <w:sz w:val="22"/>
+        </w:rPr>
+        <w:t xml:space="preserve"> to fix the start at ≈ 1/8.33 for rehearsal; the numbers quoted below (best route ×1.5 → ×6 = 180.2, etc.) are for that fixed start.</w:t>
       </w:r>
     </w:p>
     <w:p>

</xml_diff>

<commit_message>
Blackjack: dose limit = that team STANDS; add dose warning under cards
A team that reaches the dose limit now stands immediately (toast + status),
while the other team keeps playing. Adds a "stronger multiplier = more added
dose" warning line below the cards and updates rules, guide, script, checklist.

Co-Authored-By: Claude Sonnet 5.5 <noreply@anthropic.com>
</commit_message>
<xml_diff>
--- a/Knowledge_Guide.docx
+++ b/Knowledge_Guide.docx
@@ -4565,6 +4565,24 @@
       </w:tr>
     </w:tbl>
     <w:p/>
+    <w:p>
+      <w:pPr>
+        <w:pStyle w:val="ListBullet"/>
+      </w:pPr>
+      <w:r>
+        <w:rPr>
+          <w:b/>
+          <w:sz w:val="22"/>
+        </w:rPr>
+        <w:t>Dose limit = 50 (relative):</w:t>
+      </w:r>
+      <w:r>
+        <w:rPr>
+          <w:sz w:val="22"/>
+        </w:rPr>
+        <w:t xml:space="preserve"> a team that reaches it STANDS immediately; the other team keeps playing.</w:t>
+      </w:r>
+    </w:p>
     <w:sectPr>
       <w:pgSz w:w="12240" w:h="15840"/>
       <w:pgMar w:top="907" w:right="1020" w:bottom="907" w:left="1020" w:header="720" w:footer="720" w:gutter="0"/>

</xml_diff>

<commit_message>
Blackjack: new turn order (first team once, second team twice, then alternate)
Order is L R R L R L R L (4 scans each) for whichever team plays first.
No-copy now means not the card your opponent played last. Status/pill show
"Turn k of 8" and "2nd in a row". Rules screen, slide 11, script, guide and
checklist updated.

Co-Authored-By: Claude Sonnet 5.5 <noreply@anthropic.com>
</commit_message>
<xml_diff>
--- a/Knowledge_Guide.docx
+++ b/Knowledge_Guide.docx
@@ -4583,6 +4583,80 @@
         <w:t xml:space="preserve"> a team that reaches it STANDS immediately; the other team keeps playing.</w:t>
       </w:r>
     </w:p>
+    <w:p>
+      <w:pPr>
+        <w:pStyle w:val="Heading1"/>
+      </w:pPr>
+      <w:r>
+        <w:t>18. Turn order and fairness (Blackjack)</w:t>
+      </w:r>
+    </w:p>
+    <w:p>
+      <w:pPr>
+        <w:pStyle w:val="ListBullet"/>
+      </w:pPr>
+      <w:r>
+        <w:rPr>
+          <w:sz w:val="22"/>
+        </w:rPr>
+        <w:t xml:space="preserve">Order: the first team (chosen by Random) plays once, the second team then plays </w:t>
+      </w:r>
+      <w:r>
+        <w:rPr>
+          <w:b/>
+          <w:sz w:val="22"/>
+        </w:rPr>
+        <w:t>twice in a row</w:t>
+      </w:r>
+      <w:r>
+        <w:rPr>
+          <w:sz w:val="22"/>
+        </w:rPr>
+        <w:t xml:space="preserve"> as compensation for moving second, then they alternate: </w:t>
+      </w:r>
+      <w:r>
+        <w:rPr>
+          <w:b/>
+          <w:sz w:val="22"/>
+        </w:rPr>
+        <w:t>L R R L R L R L</w:t>
+      </w:r>
+      <w:r>
+        <w:rPr>
+          <w:sz w:val="22"/>
+        </w:rPr>
+        <w:t xml:space="preserve"> if Left plays first (4 scans each). Entries of a team that has stood or hit the dose limit are skipped.</w:t>
+      </w:r>
+    </w:p>
+    <w:p>
+      <w:pPr>
+        <w:pStyle w:val="ListBullet"/>
+      </w:pPr>
+      <w:r>
+        <w:rPr>
+          <w:b/>
+          <w:sz w:val="22"/>
+        </w:rPr>
+        <w:t>No copying:</w:t>
+      </w:r>
+      <w:r>
+        <w:rPr>
+          <w:sz w:val="22"/>
+        </w:rPr>
+        <w:t xml:space="preserve"> you cannot play the card your opponent played on their most recent turn.</w:t>
+      </w:r>
+    </w:p>
+    <w:p>
+      <w:pPr>
+        <w:pStyle w:val="ListBullet"/>
+      </w:pPr>
+      <w:r>
+        <w:rPr>
+          <w:sz w:val="22"/>
+        </w:rPr>
+        <w:t>Why: going first is treated as a head start on the shared game clock, so the second team gets two consecutive turns in return. The second team also sees the first team's image before choosing; whether that offsets the head start is a design choice to tune in rehearsal (an option is to hide the opponent's latest image until both have played).</w:t>
+      </w:r>
+    </w:p>
     <w:sectPr>
       <w:pgSz w:w="12240" w:h="15840"/>
       <w:pgMar w:top="907" w:right="1020" w:bottom="907" w:left="1020" w:header="720" w:footer="720" w:gutter="0"/>

</xml_diff>